<commit_message>
Materials of seminar 98 are added, seminar 99 is all set and ready
</commit_message>
<xml_diff>
--- a/assets/abstracts/Flyer_seminar98.docx
+++ b/assets/abstracts/Flyer_seminar98.docx
@@ -158,7 +158,7 @@
           <w:szCs w:val="22"/>
           <w:lang w:eastAsia="zh-CN"/>
         </w:rPr>
-        <w:t>November</w:t>
+        <w:t>December</w:t>
       </w:r>
       <w:r>
         <w:rPr>
@@ -174,15 +174,7 @@
           <w:szCs w:val="22"/>
           <w:lang w:eastAsia="zh-CN"/>
         </w:rPr>
-        <w:t>2</w:t>
-      </w:r>
-      <w:r>
-        <w:rPr>
-          <w:sz w:val="28"/>
-          <w:szCs w:val="22"/>
-          <w:lang w:eastAsia="zh-CN"/>
-        </w:rPr>
-        <w:t>6</w:t>
+        <w:t>3</w:t>
       </w:r>
       <w:r>
         <w:rPr>
@@ -791,41 +783,37 @@
         </w:rPr>
         <w:t xml:space="preserve">. </w:t>
       </w:r>
-      <w:proofErr w:type="spellStart"/>
       <w:r>
         <w:rPr>
           <w:rFonts w:ascii="Times New Roman" w:hAnsi="Times New Roman"/>
           <w:sz w:val="28"/>
           <w:szCs w:val="28"/>
         </w:rPr>
-        <w:t>Xinju</w:t>
-      </w:r>
-      <w:proofErr w:type="spellEnd"/>
+        <w:t>Xinju (Spancer) Dong</w:t>
+      </w:r>
       <w:r>
         <w:rPr>
           <w:rFonts w:ascii="Times New Roman" w:hAnsi="Times New Roman"/>
           <w:sz w:val="28"/>
           <w:szCs w:val="28"/>
         </w:rPr>
-        <w:t xml:space="preserve"> (</w:t>
-      </w:r>
-      <w:proofErr w:type="spellStart"/>
+        <w:t xml:space="preserve">, </w:t>
+      </w:r>
       <w:r>
         <w:rPr>
           <w:rFonts w:ascii="Times New Roman" w:hAnsi="Times New Roman"/>
           <w:sz w:val="28"/>
           <w:szCs w:val="28"/>
         </w:rPr>
-        <w:t>Spancer</w:t>
-      </w:r>
-      <w:proofErr w:type="spellEnd"/>
+        <w:t>Oak Ridge National Laboratory, USA</w:t>
+      </w:r>
       <w:r>
         <w:rPr>
           <w:rFonts w:ascii="Times New Roman" w:hAnsi="Times New Roman"/>
           <w:sz w:val="28"/>
           <w:szCs w:val="28"/>
         </w:rPr>
-        <w:t>) Dong</w:t>
+        <w:t>………………………………………………………………………….</w:t>
       </w:r>
       <w:r>
         <w:rPr>
@@ -833,42 +821,8 @@
           <w:sz w:val="28"/>
           <w:szCs w:val="28"/>
         </w:rPr>
-        <w:t xml:space="preserve">, </w:t>
-      </w:r>
-      <w:r>
-        <w:rPr>
-          <w:rFonts w:ascii="Times New Roman" w:hAnsi="Times New Roman"/>
-          <w:sz w:val="28"/>
-          <w:szCs w:val="28"/>
-        </w:rPr>
-        <w:t>Oak Ridge National Laboratory, USA</w:t>
-      </w:r>
-      <w:r>
-        <w:rPr>
-          <w:rFonts w:ascii="Times New Roman" w:hAnsi="Times New Roman"/>
-          <w:sz w:val="28"/>
-          <w:szCs w:val="28"/>
-        </w:rPr>
-        <w:t>………………………………………………………………………</w:t>
-      </w:r>
-      <w:proofErr w:type="gramStart"/>
-      <w:r>
-        <w:rPr>
-          <w:rFonts w:ascii="Times New Roman" w:hAnsi="Times New Roman"/>
-          <w:sz w:val="28"/>
-          <w:szCs w:val="28"/>
-        </w:rPr>
-        <w:t>….</w:t>
-      </w:r>
-      <w:r>
-        <w:rPr>
-          <w:rFonts w:ascii="Times New Roman" w:hAnsi="Times New Roman"/>
-          <w:sz w:val="28"/>
-          <w:szCs w:val="28"/>
-        </w:rPr>
         <w:t>.</w:t>
       </w:r>
-      <w:proofErr w:type="gramEnd"/>
       <w:r>
         <w:rPr>
           <w:rFonts w:ascii="Times New Roman" w:hAnsi="Times New Roman"/>
@@ -928,7 +882,6 @@
         </w:rPr>
         <w:t>……</w:t>
       </w:r>
-      <w:proofErr w:type="gramStart"/>
       <w:r>
         <w:rPr>
           <w:rFonts w:ascii="Times New Roman" w:hAnsi="Times New Roman"/>
@@ -961,7 +914,6 @@
         </w:rPr>
         <w:t>.</w:t>
       </w:r>
-      <w:proofErr w:type="gramEnd"/>
       <w:r>
         <w:rPr>
           <w:rFonts w:ascii="Times New Roman" w:hAnsi="Times New Roman"/>
@@ -1103,7 +1055,6 @@
           <w:lang w:val="fr-FR"/>
         </w:rPr>
       </w:pPr>
-      <w:proofErr w:type="spellStart"/>
       <w:r>
         <w:rPr>
           <w:rFonts w:ascii="Times New Roman" w:hAnsi="Times New Roman" w:hint="eastAsia"/>
@@ -1112,18 +1063,7 @@
           <w:u w:val="single"/>
           <w:lang w:val="fr-FR"/>
         </w:rPr>
-        <w:t>Hongli</w:t>
-      </w:r>
-      <w:proofErr w:type="spellEnd"/>
-      <w:r>
-        <w:rPr>
-          <w:rFonts w:ascii="Times New Roman" w:hAnsi="Times New Roman" w:hint="eastAsia"/>
-          <w:sz w:val="24"/>
-          <w:szCs w:val="24"/>
-          <w:u w:val="single"/>
-          <w:lang w:val="fr-FR"/>
-        </w:rPr>
-        <w:t xml:space="preserve"> Guo</w:t>
+        <w:t>Hongli Guo</w:t>
       </w:r>
       <w:r>
         <w:rPr>
@@ -1490,27 +1430,7 @@
           <w:sz w:val="24"/>
           <w:szCs w:val="24"/>
         </w:rPr>
-        <w:t xml:space="preserve"> hybrid functional, we overcome the difficulty of accurately treating excitonic effects at large scales and successfully compute the key properties of moiré excitons in twisted materials containing more than 2,000 atoms. These properties include exciton energy, dispersion, spatial localization, polarity, and optical absorption, as well as their tunability through external and structural control. Our theoretical analysis also predicts a variety of mechanisms for manipulating moiré exciton states, offering useful design guidelines for optoelectronic and quantum-photonic </w:t>
-      </w:r>
-      <w:proofErr w:type="spellStart"/>
-      <w:proofErr w:type="gramStart"/>
-      <w:r>
-        <w:rPr>
-          <w:rFonts w:ascii="Times New Roman" w:hAnsi="Times New Roman"/>
-          <w:sz w:val="24"/>
-          <w:szCs w:val="24"/>
-        </w:rPr>
-        <w:t>devices.We</w:t>
-      </w:r>
-      <w:proofErr w:type="spellEnd"/>
-      <w:proofErr w:type="gramEnd"/>
-      <w:r>
-        <w:rPr>
-          <w:rFonts w:ascii="Times New Roman" w:hAnsi="Times New Roman"/>
-          <w:sz w:val="24"/>
-          <w:szCs w:val="24"/>
-        </w:rPr>
-        <w:t xml:space="preserve"> further propose a mechanism to realize high-temperature intralayer exciton Bose–Einstein condensation (BEC) using chemical doping. Our results reveal the essential roles of the moiré potential and exciton interactions in exciton condensation and provide key physical parameters and phase diagrams that can guide the search for optimal materials.</w:t>
+        <w:t xml:space="preserve"> hybrid functional, we overcome the difficulty of accurately treating excitonic effects at large scales and successfully compute the key properties of moiré excitons in twisted materials containing more than 2,000 atoms. These properties include exciton energy, dispersion, spatial localization, polarity, and optical absorption, as well as their tunability through external and structural control. Our theoretical analysis also predicts a variety of mechanisms for manipulating moiré exciton states, offering useful design guidelines for optoelectronic and quantum-photonic devices.We further propose a mechanism to realize high-temperature intralayer exciton Bose–Einstein condensation (BEC) using chemical doping. Our results reveal the essential roles of the moiré potential and exciton interactions in exciton condensation and provide key physical parameters and phase diagrams that can guide the search for optimal materials.</w:t>
       </w:r>
       <w:r>
         <w:rPr>
@@ -1545,10 +1465,10 @@
           <w:rFonts w:ascii="Times New Roman" w:hAnsi="Times New Roman"/>
           <w:sz w:val="24"/>
           <w:szCs w:val="24"/>
+          <w:lang w:val="fr-FR"/>
         </w:rPr>
         <w:br/>
       </w:r>
-      <w:proofErr w:type="spellStart"/>
       <w:r>
         <w:rPr>
           <w:rStyle w:val="Strong"/>
@@ -1559,7 +1479,6 @@
         </w:rPr>
         <w:t>References</w:t>
       </w:r>
-      <w:proofErr w:type="spellEnd"/>
       <w:r>
         <w:rPr>
           <w:rStyle w:val="Strong"/>
@@ -1599,9 +1518,55 @@
           <w:szCs w:val="24"/>
           <w:lang w:val="fr-FR"/>
         </w:rPr>
-        <w:t xml:space="preserve">Science </w:t>
-      </w:r>
-      <w:proofErr w:type="spellStart"/>
+        <w:t>Science Advances</w:t>
+      </w:r>
+      <w:r>
+        <w:rPr>
+          <w:rFonts w:ascii="Times New Roman" w:hAnsi="Times New Roman"/>
+          <w:sz w:val="24"/>
+          <w:szCs w:val="24"/>
+          <w:lang w:val="fr-FR"/>
+        </w:rPr>
+        <w:t xml:space="preserve"> </w:t>
+      </w:r>
+      <w:r>
+        <w:rPr>
+          <w:rStyle w:val="Strong"/>
+          <w:rFonts w:ascii="Times New Roman" w:hAnsi="Times New Roman"/>
+          <w:sz w:val="24"/>
+          <w:szCs w:val="24"/>
+          <w:lang w:val="fr-FR"/>
+        </w:rPr>
+        <w:t>6</w:t>
+      </w:r>
+      <w:r>
+        <w:rPr>
+          <w:rFonts w:ascii="Times New Roman" w:hAnsi="Times New Roman"/>
+          <w:sz w:val="24"/>
+          <w:szCs w:val="24"/>
+          <w:lang w:val="fr-FR"/>
+        </w:rPr>
+        <w:t>, eabc5638 (2020).</w:t>
+      </w:r>
+    </w:p>
+    <w:p>
+      <w:pPr>
+        <w:rPr>
+          <w:rFonts w:ascii="Times New Roman" w:hAnsi="Times New Roman"/>
+          <w:sz w:val="24"/>
+          <w:szCs w:val="24"/>
+          <w:lang w:val="fr-FR"/>
+        </w:rPr>
+      </w:pPr>
+      <w:r>
+        <w:rPr>
+          <w:rFonts w:ascii="Times New Roman" w:hAnsi="Times New Roman"/>
+          <w:sz w:val="24"/>
+          <w:szCs w:val="24"/>
+          <w:lang w:val="fr-FR"/>
+        </w:rPr>
+        <w:t xml:space="preserve">[2] Guo et al., </w:t>
+      </w:r>
       <w:r>
         <w:rPr>
           <w:rStyle w:val="Emphasis"/>
@@ -1610,9 +1575,8 @@
           <w:szCs w:val="24"/>
           <w:lang w:val="fr-FR"/>
         </w:rPr>
-        <w:t>Advances</w:t>
-      </w:r>
-      <w:proofErr w:type="spellEnd"/>
+        <w:t>PNAS</w:t>
+      </w:r>
       <w:r>
         <w:rPr>
           <w:rFonts w:ascii="Times New Roman" w:hAnsi="Times New Roman"/>
@@ -1630,7 +1594,7 @@
           <w:szCs w:val="24"/>
           <w:lang w:val="fr-FR"/>
         </w:rPr>
-        <w:t>6</w:t>
+        <w:t>118</w:t>
       </w:r>
       <w:r>
         <w:rPr>
@@ -1639,46 +1603,26 @@
           <w:szCs w:val="24"/>
           <w:lang w:val="fr-FR"/>
         </w:rPr>
-        <w:t>, eabc5638 (2020).</w:t>
-      </w:r>
-    </w:p>
-    <w:p>
-      <w:pPr>
-        <w:rPr>
-          <w:rFonts w:ascii="Times New Roman" w:hAnsi="Times New Roman"/>
-          <w:sz w:val="24"/>
-          <w:szCs w:val="24"/>
-          <w:lang w:val="es-ES"/>
-        </w:rPr>
-      </w:pPr>
-      <w:r>
-        <w:rPr>
-          <w:rFonts w:ascii="Times New Roman" w:hAnsi="Times New Roman"/>
-          <w:sz w:val="24"/>
-          <w:szCs w:val="24"/>
-          <w:lang w:val="es-ES"/>
-        </w:rPr>
-        <w:t xml:space="preserve">[2] </w:t>
-      </w:r>
-      <w:proofErr w:type="spellStart"/>
-      <w:r>
-        <w:rPr>
-          <w:rFonts w:ascii="Times New Roman" w:hAnsi="Times New Roman"/>
-          <w:sz w:val="24"/>
-          <w:szCs w:val="24"/>
-          <w:lang w:val="es-ES"/>
-        </w:rPr>
-        <w:t>Guo</w:t>
-      </w:r>
-      <w:proofErr w:type="spellEnd"/>
-      <w:r>
-        <w:rPr>
-          <w:rFonts w:ascii="Times New Roman" w:hAnsi="Times New Roman"/>
-          <w:sz w:val="24"/>
-          <w:szCs w:val="24"/>
-          <w:lang w:val="es-ES"/>
-        </w:rPr>
-        <w:t xml:space="preserve"> et al., </w:t>
+        <w:t xml:space="preserve"> (32), e2105468118 (2021).</w:t>
+      </w:r>
+    </w:p>
+    <w:p>
+      <w:pPr>
+        <w:rPr>
+          <w:rFonts w:ascii="Times New Roman" w:hAnsi="Times New Roman"/>
+          <w:sz w:val="24"/>
+          <w:szCs w:val="24"/>
+          <w:lang w:val="fr-FR"/>
+        </w:rPr>
+      </w:pPr>
+      <w:r>
+        <w:rPr>
+          <w:rFonts w:ascii="Times New Roman" w:hAnsi="Times New Roman"/>
+          <w:sz w:val="24"/>
+          <w:szCs w:val="24"/>
+          <w:lang w:val="fr-FR"/>
+        </w:rPr>
+        <w:t xml:space="preserve">[3] Guo et al., </w:t>
       </w:r>
       <w:r>
         <w:rPr>
@@ -1686,16 +1630,16 @@
           <w:rFonts w:ascii="Times New Roman" w:hAnsi="Times New Roman"/>
           <w:sz w:val="24"/>
           <w:szCs w:val="24"/>
-          <w:lang w:val="es-ES"/>
-        </w:rPr>
-        <w:t>PNAS</w:t>
-      </w:r>
-      <w:r>
-        <w:rPr>
-          <w:rFonts w:ascii="Times New Roman" w:hAnsi="Times New Roman"/>
-          <w:sz w:val="24"/>
-          <w:szCs w:val="24"/>
-          <w:lang w:val="es-ES"/>
+          <w:lang w:val="fr-FR"/>
+        </w:rPr>
+        <w:t>Science Advances</w:t>
+      </w:r>
+      <w:r>
+        <w:rPr>
+          <w:rFonts w:ascii="Times New Roman" w:hAnsi="Times New Roman"/>
+          <w:sz w:val="24"/>
+          <w:szCs w:val="24"/>
+          <w:lang w:val="fr-FR"/>
         </w:rPr>
         <w:t xml:space="preserve"> </w:t>
       </w:r>
@@ -1705,29 +1649,10 @@
           <w:rFonts w:ascii="Times New Roman" w:hAnsi="Times New Roman"/>
           <w:sz w:val="24"/>
           <w:szCs w:val="24"/>
-          <w:lang w:val="es-ES"/>
-        </w:rPr>
-        <w:t>118</w:t>
-      </w:r>
-      <w:r>
-        <w:rPr>
-          <w:rFonts w:ascii="Times New Roman" w:hAnsi="Times New Roman"/>
-          <w:sz w:val="24"/>
-          <w:szCs w:val="24"/>
-          <w:lang w:val="es-ES"/>
-        </w:rPr>
-        <w:t xml:space="preserve"> (32), e2105468118 (2021).</w:t>
-      </w:r>
-    </w:p>
-    <w:p>
-      <w:pPr>
-        <w:rPr>
-          <w:rFonts w:ascii="Times New Roman" w:hAnsi="Times New Roman"/>
-          <w:sz w:val="24"/>
-          <w:szCs w:val="24"/>
           <w:lang w:val="fr-FR"/>
         </w:rPr>
-      </w:pPr>
+        <w:t>8</w:t>
+      </w:r>
       <w:r>
         <w:rPr>
           <w:rFonts w:ascii="Times New Roman" w:hAnsi="Times New Roman"/>
@@ -1735,7 +1660,26 @@
           <w:szCs w:val="24"/>
           <w:lang w:val="fr-FR"/>
         </w:rPr>
-        <w:t xml:space="preserve">[3] Guo et al., </w:t>
+        <w:t xml:space="preserve"> (40), eabp9757 (2022).</w:t>
+      </w:r>
+    </w:p>
+    <w:p>
+      <w:pPr>
+        <w:rPr>
+          <w:rFonts w:ascii="Times New Roman" w:hAnsi="Times New Roman"/>
+          <w:sz w:val="24"/>
+          <w:szCs w:val="24"/>
+          <w:lang w:val="fr-FR"/>
+        </w:rPr>
+      </w:pPr>
+      <w:r>
+        <w:rPr>
+          <w:rFonts w:ascii="Times New Roman" w:hAnsi="Times New Roman"/>
+          <w:sz w:val="24"/>
+          <w:szCs w:val="24"/>
+          <w:lang w:val="fr-FR"/>
+        </w:rPr>
+        <w:t xml:space="preserve">[4] Guo et al., </w:t>
       </w:r>
       <w:r>
         <w:rPr>
@@ -1745,89 +1689,8 @@
           <w:szCs w:val="24"/>
           <w:lang w:val="fr-FR"/>
         </w:rPr>
-        <w:t xml:space="preserve">Science </w:t>
-      </w:r>
-      <w:proofErr w:type="spellStart"/>
-      <w:r>
-        <w:rPr>
-          <w:rStyle w:val="Emphasis"/>
-          <w:rFonts w:ascii="Times New Roman" w:hAnsi="Times New Roman"/>
-          <w:sz w:val="24"/>
-          <w:szCs w:val="24"/>
-          <w:lang w:val="fr-FR"/>
-        </w:rPr>
-        <w:t>Advances</w:t>
-      </w:r>
-      <w:proofErr w:type="spellEnd"/>
-      <w:r>
-        <w:rPr>
-          <w:rFonts w:ascii="Times New Roman" w:hAnsi="Times New Roman"/>
-          <w:sz w:val="24"/>
-          <w:szCs w:val="24"/>
-          <w:lang w:val="fr-FR"/>
-        </w:rPr>
-        <w:t xml:space="preserve"> </w:t>
-      </w:r>
-      <w:r>
-        <w:rPr>
-          <w:rStyle w:val="Strong"/>
-          <w:rFonts w:ascii="Times New Roman" w:hAnsi="Times New Roman"/>
-          <w:sz w:val="24"/>
-          <w:szCs w:val="24"/>
-          <w:lang w:val="fr-FR"/>
-        </w:rPr>
-        <w:t>8</w:t>
-      </w:r>
-      <w:r>
-        <w:rPr>
-          <w:rFonts w:ascii="Times New Roman" w:hAnsi="Times New Roman"/>
-          <w:sz w:val="24"/>
-          <w:szCs w:val="24"/>
-          <w:lang w:val="fr-FR"/>
-        </w:rPr>
-        <w:t xml:space="preserve"> (40), eabp9757 (2022).</w:t>
-      </w:r>
-    </w:p>
-    <w:p>
-      <w:pPr>
-        <w:rPr>
-          <w:rFonts w:ascii="Times New Roman" w:hAnsi="Times New Roman"/>
-          <w:sz w:val="24"/>
-          <w:szCs w:val="24"/>
-          <w:lang w:val="fr-FR"/>
-        </w:rPr>
-      </w:pPr>
-      <w:r>
-        <w:rPr>
-          <w:rFonts w:ascii="Times New Roman" w:hAnsi="Times New Roman"/>
-          <w:sz w:val="24"/>
-          <w:szCs w:val="24"/>
-          <w:lang w:val="fr-FR"/>
-        </w:rPr>
-        <w:t xml:space="preserve">[4] Guo et al., </w:t>
-      </w:r>
-      <w:r>
-        <w:rPr>
-          <w:rStyle w:val="Emphasis"/>
-          <w:rFonts w:ascii="Times New Roman" w:hAnsi="Times New Roman"/>
-          <w:sz w:val="24"/>
-          <w:szCs w:val="24"/>
-          <w:lang w:val="fr-FR"/>
-        </w:rPr>
-        <w:t xml:space="preserve">Science </w:t>
-      </w:r>
-      <w:proofErr w:type="spellStart"/>
-      <w:r>
-        <w:rPr>
-          <w:rStyle w:val="Emphasis"/>
-          <w:rFonts w:ascii="Times New Roman" w:hAnsi="Times New Roman"/>
-          <w:sz w:val="24"/>
-          <w:szCs w:val="24"/>
-          <w:lang w:val="fr-FR"/>
-        </w:rPr>
-        <w:t>Advances</w:t>
-      </w:r>
-      <w:proofErr w:type="spellEnd"/>
+        <w:t>Science Advances</w:t>
+      </w:r>
       <w:r>
         <w:rPr>
           <w:rFonts w:ascii="Times New Roman" w:hAnsi="Times New Roman"/>
@@ -1885,7 +1748,6 @@
           <w:szCs w:val="28"/>
         </w:rPr>
       </w:pPr>
-      <w:proofErr w:type="gramStart"/>
       <w:r>
         <w:rPr>
           <w:rFonts w:ascii="Times New Roman" w:hAnsi="Times New Roman"/>
@@ -1895,60 +1757,7 @@
           <w:szCs w:val="28"/>
         </w:rPr>
         <w:lastRenderedPageBreak/>
-        <w:t>Inter(</w:t>
-      </w:r>
-      <w:proofErr w:type="gramEnd"/>
-      <w:r>
-        <w:rPr>
-          <w:rFonts w:ascii="Times New Roman" w:hAnsi="Times New Roman"/>
-          <w:b/>
-          <w:bCs/>
-          <w:sz w:val="28"/>
-          <w:szCs w:val="28"/>
-        </w:rPr>
-        <w:t xml:space="preserve">Intra)molecular Singlet Fission Study Using </w:t>
-      </w:r>
-      <w:proofErr w:type="spellStart"/>
-      <w:r>
-        <w:rPr>
-          <w:rFonts w:ascii="Times New Roman" w:hAnsi="Times New Roman"/>
-          <w:b/>
-          <w:bCs/>
-          <w:sz w:val="28"/>
-          <w:szCs w:val="28"/>
-        </w:rPr>
-        <w:t>GronOR</w:t>
-      </w:r>
-      <w:proofErr w:type="spellEnd"/>
-      <w:r>
-        <w:rPr>
-          <w:rFonts w:ascii="Times New Roman" w:hAnsi="Times New Roman"/>
-          <w:b/>
-          <w:bCs/>
-          <w:sz w:val="28"/>
-          <w:szCs w:val="28"/>
-        </w:rPr>
-        <w:t xml:space="preserve"> Non-Orthogonal</w:t>
-      </w:r>
-      <w:r>
-        <w:rPr>
-          <w:rFonts w:ascii="Times New Roman" w:hAnsi="Times New Roman"/>
-          <w:b/>
-          <w:bCs/>
-          <w:sz w:val="28"/>
-          <w:szCs w:val="28"/>
-        </w:rPr>
-        <w:t xml:space="preserve"> </w:t>
-      </w:r>
-      <w:r>
-        <w:rPr>
-          <w:rFonts w:ascii="Times New Roman" w:hAnsi="Times New Roman"/>
-          <w:b/>
-          <w:bCs/>
-          <w:sz w:val="28"/>
-          <w:szCs w:val="28"/>
-        </w:rPr>
-        <w:t>Configuration Interaction Method</w:t>
+        <w:t>Inter(Intra)molecular Singlet Fission Study Using GronOR Non-Orthogonal Configuration Interaction Method</w:t>
       </w:r>
     </w:p>
     <w:p>
@@ -1962,7 +1771,6 @@
           <w:vertAlign w:val="superscript"/>
         </w:rPr>
       </w:pPr>
-      <w:proofErr w:type="spellStart"/>
       <w:r>
         <w:rPr>
           <w:rFonts w:ascii="Times New Roman" w:hAnsi="Times New Roman"/>
@@ -1972,7 +1780,6 @@
         </w:rPr>
         <w:t>Xinju</w:t>
       </w:r>
-      <w:proofErr w:type="spellEnd"/>
       <w:r>
         <w:rPr>
           <w:rFonts w:ascii="Times New Roman" w:hAnsi="Times New Roman"/>
@@ -1989,27 +1796,7 @@
           <w:szCs w:val="24"/>
           <w:u w:val="single"/>
         </w:rPr>
-        <w:t>(</w:t>
-      </w:r>
-      <w:proofErr w:type="spellStart"/>
-      <w:r>
-        <w:rPr>
-          <w:rFonts w:ascii="Times New Roman" w:hAnsi="Times New Roman"/>
-          <w:sz w:val="24"/>
-          <w:szCs w:val="24"/>
-          <w:u w:val="single"/>
-        </w:rPr>
-        <w:t>Spancer</w:t>
-      </w:r>
-      <w:proofErr w:type="spellEnd"/>
-      <w:r>
-        <w:rPr>
-          <w:rFonts w:ascii="Times New Roman" w:hAnsi="Times New Roman"/>
-          <w:sz w:val="24"/>
-          <w:szCs w:val="24"/>
-          <w:u w:val="single"/>
-        </w:rPr>
-        <w:t>) Dong</w:t>
+        <w:t>(Spancer) Dong</w:t>
       </w:r>
       <w:r>
         <w:rPr>
@@ -2192,10 +1979,13 @@
           <w:sz w:val="24"/>
           <w:szCs w:val="24"/>
         </w:rPr>
-        <w:t xml:space="preserve">1). Oak Ridge National Laboratory, Oak Ridge, TN, USA. 2) </w:t>
-      </w:r>
-      <w:proofErr w:type="spellStart"/>
-      <w:r>
+        <w:t>1). Oak Ridge National Laboratory, Oak Ridge, TN, USA. 2) Universitat Rovira i Virgili, Tarragona, Spain 3) ICREA, Barecelona, Spain. 4) University of</w:t>
+      </w:r>
+    </w:p>
+    <w:p>
+      <w:pPr>
+        <w:spacing w:line="276" w:lineRule="auto"/>
+        <w:jc w:val="center"/>
         <w:rPr>
           <w:rFonts w:ascii="Times New Roman" w:hAnsi="Times New Roman"/>
           <w:i/>
@@ -2203,9 +1993,7 @@
           <w:sz w:val="24"/>
           <w:szCs w:val="24"/>
         </w:rPr>
-        <w:t>Universitat</w:t>
-      </w:r>
-      <w:proofErr w:type="spellEnd"/>
+      </w:pPr>
       <w:r>
         <w:rPr>
           <w:rFonts w:ascii="Times New Roman" w:hAnsi="Times New Roman"/>
@@ -2214,96 +2002,7 @@
           <w:sz w:val="24"/>
           <w:szCs w:val="24"/>
         </w:rPr>
-        <w:t xml:space="preserve"> Rovira </w:t>
-      </w:r>
-      <w:proofErr w:type="spellStart"/>
-      <w:r>
-        <w:rPr>
-          <w:rFonts w:ascii="Times New Roman" w:hAnsi="Times New Roman"/>
-          <w:i/>
-          <w:iCs/>
-          <w:sz w:val="24"/>
-          <w:szCs w:val="24"/>
-        </w:rPr>
-        <w:t>i</w:t>
-      </w:r>
-      <w:proofErr w:type="spellEnd"/>
-      <w:r>
-        <w:rPr>
-          <w:rFonts w:ascii="Times New Roman" w:hAnsi="Times New Roman"/>
-          <w:i/>
-          <w:iCs/>
-          <w:sz w:val="24"/>
-          <w:szCs w:val="24"/>
-        </w:rPr>
-        <w:t xml:space="preserve"> Virgili, Tarragona, Spain 3) ICREA, </w:t>
-      </w:r>
-      <w:proofErr w:type="spellStart"/>
-      <w:r>
-        <w:rPr>
-          <w:rFonts w:ascii="Times New Roman" w:hAnsi="Times New Roman"/>
-          <w:i/>
-          <w:iCs/>
-          <w:sz w:val="24"/>
-          <w:szCs w:val="24"/>
-        </w:rPr>
-        <w:t>Barecelona</w:t>
-      </w:r>
-      <w:proofErr w:type="spellEnd"/>
-      <w:r>
-        <w:rPr>
-          <w:rFonts w:ascii="Times New Roman" w:hAnsi="Times New Roman"/>
-          <w:i/>
-          <w:iCs/>
-          <w:sz w:val="24"/>
-          <w:szCs w:val="24"/>
-        </w:rPr>
-        <w:t>, Spain. 4) University of</w:t>
-      </w:r>
-    </w:p>
-    <w:p>
-      <w:pPr>
-        <w:spacing w:line="276" w:lineRule="auto"/>
-        <w:jc w:val="center"/>
-        <w:rPr>
-          <w:rFonts w:ascii="Times New Roman" w:hAnsi="Times New Roman"/>
-          <w:i/>
-          <w:iCs/>
-          <w:sz w:val="24"/>
-          <w:szCs w:val="24"/>
-        </w:rPr>
-      </w:pPr>
-      <w:r>
-        <w:rPr>
-          <w:rFonts w:ascii="Times New Roman" w:hAnsi="Times New Roman"/>
-          <w:i/>
-          <w:iCs/>
-          <w:sz w:val="24"/>
-          <w:szCs w:val="24"/>
-        </w:rPr>
-        <w:t xml:space="preserve">Groningen, Groningen, the Netherlands. 5). </w:t>
-      </w:r>
-      <w:proofErr w:type="spellStart"/>
-      <w:r>
-        <w:rPr>
-          <w:rFonts w:ascii="Times New Roman" w:hAnsi="Times New Roman"/>
-          <w:i/>
-          <w:iCs/>
-          <w:sz w:val="24"/>
-          <w:szCs w:val="24"/>
-        </w:rPr>
-        <w:t>Universitat</w:t>
-      </w:r>
-      <w:proofErr w:type="spellEnd"/>
-      <w:r>
-        <w:rPr>
-          <w:rFonts w:ascii="Times New Roman" w:hAnsi="Times New Roman"/>
-          <w:i/>
-          <w:iCs/>
-          <w:sz w:val="24"/>
-          <w:szCs w:val="24"/>
-        </w:rPr>
-        <w:t xml:space="preserve"> de Barcelona, Barcelona, Spain, 6). University of Alabama, Tuscaloosa, AB</w:t>
+        <w:t>Groningen, Groningen, the Netherlands. 5). Universitat de Barcelona, Barcelona, Spain, 6). University of Alabama, Tuscaloosa, AB</w:t>
       </w:r>
     </w:p>
     <w:p>
@@ -2355,6 +2054,7 @@
       <w:r>
         <w:rPr>
           <w:rFonts w:ascii="Times New Roman" w:hAnsi="Times New Roman"/>
+          <w:noProof/>
           <w:sz w:val="24"/>
           <w:szCs w:val="24"/>
         </w:rPr>
@@ -2405,6 +2105,7 @@
       <w:r>
         <w:rPr>
           <w:rFonts w:ascii="Times New Roman" w:hAnsi="Times New Roman"/>
+          <w:noProof/>
           <w:sz w:val="24"/>
           <w:szCs w:val="24"/>
         </w:rPr>
@@ -2521,18 +2222,8 @@
           <w:sz w:val="24"/>
           <w:szCs w:val="24"/>
         </w:rPr>
-        <w:t xml:space="preserve">icient </w:t>
-      </w:r>
-      <w:proofErr w:type="spellStart"/>
-      <w:r>
-        <w:rPr>
-          <w:rFonts w:ascii="Times New Roman" w:hAnsi="Times New Roman"/>
-          <w:sz w:val="24"/>
-          <w:szCs w:val="24"/>
-        </w:rPr>
-        <w:t>photoharvesting</w:t>
-      </w:r>
-      <w:proofErr w:type="spellEnd"/>
+        <w:t>icient photoharvesting</w:t>
+      </w:r>
       <w:r>
         <w:rPr>
           <w:rFonts w:ascii="Times New Roman" w:hAnsi="Times New Roman"/>
@@ -2596,25 +2287,7 @@
           <w:sz w:val="24"/>
           <w:szCs w:val="24"/>
         </w:rPr>
-        <w:t xml:space="preserve">obtained directly from experiments. The core methodology of </w:t>
-      </w:r>
-      <w:proofErr w:type="spellStart"/>
-      <w:r>
-        <w:rPr>
-          <w:rFonts w:ascii="Times New Roman" w:hAnsi="Times New Roman"/>
-          <w:sz w:val="24"/>
-          <w:szCs w:val="24"/>
-        </w:rPr>
-        <w:t>GronOR</w:t>
-      </w:r>
-      <w:proofErr w:type="spellEnd"/>
-      <w:r>
-        <w:rPr>
-          <w:rFonts w:ascii="Times New Roman" w:hAnsi="Times New Roman"/>
-          <w:sz w:val="24"/>
-          <w:szCs w:val="24"/>
-        </w:rPr>
-        <w:t xml:space="preserve"> is non-orthogonal</w:t>
+        <w:t>obtained directly from experiments. The core methodology of GronOR is non-orthogonal</w:t>
       </w:r>
       <w:r>
         <w:rPr>
@@ -2662,25 +2335,7 @@
           <w:sz w:val="24"/>
           <w:szCs w:val="24"/>
         </w:rPr>
-        <w:t xml:space="preserve">on an advanced worker-master execution model, </w:t>
-      </w:r>
-      <w:proofErr w:type="spellStart"/>
-      <w:r>
-        <w:rPr>
-          <w:rFonts w:ascii="Times New Roman" w:hAnsi="Times New Roman"/>
-          <w:sz w:val="24"/>
-          <w:szCs w:val="24"/>
-        </w:rPr>
-        <w:t>GronOR</w:t>
-      </w:r>
-      <w:proofErr w:type="spellEnd"/>
-      <w:r>
-        <w:rPr>
-          <w:rFonts w:ascii="Times New Roman" w:hAnsi="Times New Roman"/>
-          <w:sz w:val="24"/>
-          <w:szCs w:val="24"/>
-        </w:rPr>
-        <w:t xml:space="preserve"> computes the Hamiltonian matrix</w:t>
+        <w:t>on an advanced worker-master execution model, GronOR computes the Hamiltonian matrix</w:t>
       </w:r>
       <w:r>
         <w:rPr>
@@ -2762,25 +2417,7 @@
           <w:sz w:val="24"/>
           <w:szCs w:val="24"/>
         </w:rPr>
-        <w:t xml:space="preserve">and performance of </w:t>
-      </w:r>
-      <w:proofErr w:type="spellStart"/>
-      <w:r>
-        <w:rPr>
-          <w:rFonts w:ascii="Times New Roman" w:hAnsi="Times New Roman"/>
-          <w:sz w:val="24"/>
-          <w:szCs w:val="24"/>
-        </w:rPr>
-        <w:t>GronOR</w:t>
-      </w:r>
-      <w:proofErr w:type="spellEnd"/>
-      <w:r>
-        <w:rPr>
-          <w:rFonts w:ascii="Times New Roman" w:hAnsi="Times New Roman"/>
-          <w:sz w:val="24"/>
-          <w:szCs w:val="24"/>
-        </w:rPr>
-        <w:t xml:space="preserve"> on HPCs will be illustrated.</w:t>
+        <w:t>and performance of GronOR on HPCs will be illustrated.</w:t>
       </w:r>
     </w:p>
     <w:p>
@@ -2812,7 +2449,7 @@
           <w:sz w:val="24"/>
           <w:szCs w:val="24"/>
         </w:rPr>
-        <w:t>Reference</w:t>
+        <w:t>References</w:t>
       </w:r>
       <w:r>
         <w:rPr>
@@ -2822,16 +2459,6 @@
           <w:sz w:val="24"/>
           <w:szCs w:val="24"/>
         </w:rPr>
-        <w:t>s</w:t>
-      </w:r>
-      <w:r>
-        <w:rPr>
-          <w:rFonts w:ascii="Times New Roman" w:hAnsi="Times New Roman"/>
-          <w:b/>
-          <w:bCs/>
-          <w:sz w:val="24"/>
-          <w:szCs w:val="24"/>
-        </w:rPr>
         <w:t>:</w:t>
       </w:r>
     </w:p>
@@ -2850,141 +2477,41 @@
           <w:sz w:val="20"/>
           <w:szCs w:val="20"/>
         </w:rPr>
-        <w:t xml:space="preserve">1). </w:t>
-      </w:r>
-      <w:proofErr w:type="spellStart"/>
+        <w:t>1). Straatsma, T. P., Broer, R., Faraji, S., Havenith, R. W. A., Suarez, L. E., Kathir, R. K., ... &amp; De Graaf, C. (2020). GronOR: Massively parallel and GPUaccelerated</w:t>
+      </w:r>
       <w:r>
         <w:rPr>
           <w:rFonts w:ascii="Times New Roman" w:hAnsi="Times New Roman"/>
           <w:sz w:val="20"/>
           <w:szCs w:val="20"/>
         </w:rPr>
-        <w:t>Straatsma</w:t>
-      </w:r>
-      <w:proofErr w:type="spellEnd"/>
+        <w:t xml:space="preserve"> </w:t>
+      </w:r>
       <w:r>
         <w:rPr>
           <w:rFonts w:ascii="Times New Roman" w:hAnsi="Times New Roman"/>
           <w:sz w:val="20"/>
           <w:szCs w:val="20"/>
         </w:rPr>
-        <w:t xml:space="preserve">, T. P., Broer, R., Faraji, S., </w:t>
-      </w:r>
-      <w:proofErr w:type="spellStart"/>
-      <w:r>
+        <w:t>non-orthogonal configuration interaction for large molecular systems. The Journal of Chemical Physics, 152(6).</w:t>
+      </w:r>
+    </w:p>
+    <w:p>
+      <w:pPr>
+        <w:spacing w:line="276" w:lineRule="auto"/>
         <w:rPr>
           <w:rFonts w:ascii="Times New Roman" w:hAnsi="Times New Roman"/>
           <w:sz w:val="20"/>
           <w:szCs w:val="20"/>
         </w:rPr>
-        <w:t>Havenith</w:t>
-      </w:r>
-      <w:proofErr w:type="spellEnd"/>
+      </w:pPr>
       <w:r>
         <w:rPr>
           <w:rFonts w:ascii="Times New Roman" w:hAnsi="Times New Roman"/>
           <w:sz w:val="20"/>
           <w:szCs w:val="20"/>
         </w:rPr>
-        <w:t xml:space="preserve">, R. W. A., Suarez, L. E., Kathir, R. K., ... &amp; De Graaf, C. (2020). </w:t>
-      </w:r>
-      <w:proofErr w:type="spellStart"/>
-      <w:r>
-        <w:rPr>
-          <w:rFonts w:ascii="Times New Roman" w:hAnsi="Times New Roman"/>
-          <w:sz w:val="20"/>
-          <w:szCs w:val="20"/>
-        </w:rPr>
-        <w:t>GronOR</w:t>
-      </w:r>
-      <w:proofErr w:type="spellEnd"/>
-      <w:r>
-        <w:rPr>
-          <w:rFonts w:ascii="Times New Roman" w:hAnsi="Times New Roman"/>
-          <w:sz w:val="20"/>
-          <w:szCs w:val="20"/>
-        </w:rPr>
-        <w:t xml:space="preserve">: Massively parallel and </w:t>
-      </w:r>
-      <w:proofErr w:type="spellStart"/>
-      <w:r>
-        <w:rPr>
-          <w:rFonts w:ascii="Times New Roman" w:hAnsi="Times New Roman"/>
-          <w:sz w:val="20"/>
-          <w:szCs w:val="20"/>
-        </w:rPr>
-        <w:t>GPUaccelerated</w:t>
-      </w:r>
-      <w:proofErr w:type="spellEnd"/>
-      <w:r>
-        <w:rPr>
-          <w:rFonts w:ascii="Times New Roman" w:hAnsi="Times New Roman"/>
-          <w:sz w:val="20"/>
-          <w:szCs w:val="20"/>
-        </w:rPr>
-        <w:t xml:space="preserve"> </w:t>
-      </w:r>
-      <w:r>
-        <w:rPr>
-          <w:rFonts w:ascii="Times New Roman" w:hAnsi="Times New Roman"/>
-          <w:sz w:val="20"/>
-          <w:szCs w:val="20"/>
-        </w:rPr>
-        <w:t>non-orthogonal configuration interaction for large molecular systems. The Journal of Chemical Physics, 152(6).</w:t>
-      </w:r>
-    </w:p>
-    <w:p>
-      <w:pPr>
-        <w:spacing w:line="276" w:lineRule="auto"/>
-        <w:rPr>
-          <w:rFonts w:ascii="Times New Roman" w:hAnsi="Times New Roman"/>
-          <w:sz w:val="20"/>
-          <w:szCs w:val="20"/>
-        </w:rPr>
-      </w:pPr>
-      <w:r>
-        <w:rPr>
-          <w:rFonts w:ascii="Times New Roman" w:hAnsi="Times New Roman"/>
-          <w:sz w:val="20"/>
-          <w:szCs w:val="20"/>
-        </w:rPr>
-        <w:t xml:space="preserve">2). </w:t>
-      </w:r>
-      <w:proofErr w:type="spellStart"/>
-      <w:r>
-        <w:rPr>
-          <w:rFonts w:ascii="Times New Roman" w:hAnsi="Times New Roman"/>
-          <w:sz w:val="20"/>
-          <w:szCs w:val="20"/>
-        </w:rPr>
-        <w:t>Straatsma</w:t>
-      </w:r>
-      <w:proofErr w:type="spellEnd"/>
-      <w:r>
-        <w:rPr>
-          <w:rFonts w:ascii="Times New Roman" w:hAnsi="Times New Roman"/>
-          <w:sz w:val="20"/>
-          <w:szCs w:val="20"/>
-        </w:rPr>
-        <w:t xml:space="preserve">, T. P., Broer, R., Sánchez-Mansilla, A., Sousa, C., &amp; De Graaf, C. (2022). </w:t>
-      </w:r>
-      <w:proofErr w:type="spellStart"/>
-      <w:r>
-        <w:rPr>
-          <w:rFonts w:ascii="Times New Roman" w:hAnsi="Times New Roman"/>
-          <w:sz w:val="20"/>
-          <w:szCs w:val="20"/>
-        </w:rPr>
-        <w:t>GronOR</w:t>
-      </w:r>
-      <w:proofErr w:type="spellEnd"/>
-      <w:r>
-        <w:rPr>
-          <w:rFonts w:ascii="Times New Roman" w:hAnsi="Times New Roman"/>
-          <w:sz w:val="20"/>
-          <w:szCs w:val="20"/>
-        </w:rPr>
-        <w:t>: Scalable and accelerated nonorthogonal</w:t>
+        <w:t>2). Straatsma, T. P., Broer, R., Sánchez-Mansilla, A., Sousa, C., &amp; De Graaf, C. (2022). GronOR: Scalable and accelerated nonorthogonal</w:t>
       </w:r>
       <w:r>
         <w:rPr>
@@ -3054,93 +2581,49 @@
           <w:sz w:val="20"/>
           <w:szCs w:val="20"/>
         </w:rPr>
-        <w:t xml:space="preserve">3). Sousa, C., Lopez, X., Dong, X., Broer, R., </w:t>
-      </w:r>
-      <w:proofErr w:type="spellStart"/>
+        <w:t>3). Sousa, C., Lopez, X., Dong, X., Broer, R., Straatsma, T. P., &amp; de Graaf, C. (2025). Nonorthogonal Configuration Interaction for Singlet Fission:</w:t>
+      </w:r>
       <w:r>
         <w:rPr>
           <w:rFonts w:ascii="Times New Roman" w:hAnsi="Times New Roman"/>
           <w:sz w:val="20"/>
           <w:szCs w:val="20"/>
         </w:rPr>
-        <w:t>Straatsma</w:t>
-      </w:r>
-      <w:proofErr w:type="spellEnd"/>
+        <w:t xml:space="preserve"> </w:t>
+      </w:r>
       <w:r>
         <w:rPr>
           <w:rFonts w:ascii="Times New Roman" w:hAnsi="Times New Roman"/>
           <w:sz w:val="20"/>
           <w:szCs w:val="20"/>
         </w:rPr>
-        <w:t>, T. P., &amp; de Graaf, C. (2025). Nonorthogonal Configuration Interaction for Singlet Fission:</w:t>
-      </w:r>
-      <w:r>
+        <w:t>Beyond the Dimer. The Journal of Physical Chemistry C, 129(8), 4290-4302.</w:t>
+      </w:r>
+    </w:p>
+    <w:p>
+      <w:pPr>
+        <w:spacing w:line="276" w:lineRule="auto"/>
         <w:rPr>
           <w:rFonts w:ascii="Times New Roman" w:hAnsi="Times New Roman"/>
           <w:sz w:val="20"/>
           <w:szCs w:val="20"/>
         </w:rPr>
-        <w:t xml:space="preserve"> </w:t>
-      </w:r>
+      </w:pPr>
       <w:r>
         <w:rPr>
           <w:rFonts w:ascii="Times New Roman" w:hAnsi="Times New Roman"/>
           <w:sz w:val="20"/>
           <w:szCs w:val="20"/>
         </w:rPr>
-        <w:t>Beyond the Dimer. The Journal of Physical Chemistry C, 129(8), 4290-4302.</w:t>
-      </w:r>
-    </w:p>
-    <w:p>
-      <w:pPr>
-        <w:spacing w:line="276" w:lineRule="auto"/>
+        <w:t>4). Sousa, C., Dong, X., Broer, R., Straatsma, T. P., &amp; de Graaf, C. (2025). The overlapping fragment approach for Non-orthogonal Configuration</w:t>
+      </w:r>
+      <w:r>
         <w:rPr>
           <w:rFonts w:ascii="Times New Roman" w:hAnsi="Times New Roman"/>
           <w:sz w:val="20"/>
           <w:szCs w:val="20"/>
         </w:rPr>
-      </w:pPr>
-      <w:r>
-        <w:rPr>
-          <w:rFonts w:ascii="Times New Roman" w:hAnsi="Times New Roman"/>
-          <w:sz w:val="20"/>
-          <w:szCs w:val="20"/>
-        </w:rPr>
-        <w:t xml:space="preserve">4). Sousa, C., Dong, X., Broer, R., </w:t>
-      </w:r>
-      <w:proofErr w:type="spellStart"/>
-      <w:r>
-        <w:rPr>
-          <w:rFonts w:ascii="Times New Roman" w:hAnsi="Times New Roman"/>
-          <w:sz w:val="20"/>
-          <w:szCs w:val="20"/>
-        </w:rPr>
-        <w:t>Straatsma</w:t>
-      </w:r>
-      <w:proofErr w:type="spellEnd"/>
-      <w:r>
-        <w:rPr>
-          <w:rFonts w:ascii="Times New Roman" w:hAnsi="Times New Roman"/>
-          <w:sz w:val="20"/>
-          <w:szCs w:val="20"/>
-        </w:rPr>
-        <w:t>, T. P., &amp; de Graaf, C. (2025). The overlapping fragment approach for Non-orthogonal Configuration</w:t>
-      </w:r>
-      <w:r>
-        <w:rPr>
-          <w:rFonts w:ascii="Times New Roman" w:hAnsi="Times New Roman"/>
-          <w:sz w:val="20"/>
-          <w:szCs w:val="20"/>
-        </w:rPr>
-        <w:t xml:space="preserve"> </w:t>
-      </w:r>
-      <w:r>
-        <w:rPr>
-          <w:rFonts w:ascii="Times New Roman" w:hAnsi="Times New Roman"/>
-          <w:sz w:val="20"/>
-          <w:szCs w:val="20"/>
-        </w:rPr>
-        <w:t>Interaction with fragments. Physical Chemistry Chemical Physics.</w:t>
+        <w:t xml:space="preserve"> Interaction with fragments. Physical Chemistry Chemical Physics.</w:t>
       </w:r>
     </w:p>
     <w:p>
@@ -3237,25 +2720,39 @@
           <w:sz w:val="24"/>
           <w:szCs w:val="24"/>
         </w:rPr>
-        <w:t xml:space="preserve">Time: Nov 26, </w:t>
-      </w:r>
-      <w:proofErr w:type="gramStart"/>
-      <w:r>
-        <w:rPr>
-          <w:rFonts w:ascii="Times New Roman" w:hAnsi="Times New Roman"/>
-          <w:sz w:val="24"/>
-          <w:szCs w:val="24"/>
-        </w:rPr>
-        <w:t>2025</w:t>
-      </w:r>
-      <w:proofErr w:type="gramEnd"/>
-      <w:r>
-        <w:rPr>
-          <w:rFonts w:ascii="Times New Roman" w:hAnsi="Times New Roman"/>
-          <w:sz w:val="24"/>
-          <w:szCs w:val="24"/>
-        </w:rPr>
-        <w:t xml:space="preserve"> 10:00 AM Eastern Time (US and Canada)</w:t>
+        <w:t xml:space="preserve">Time: </w:t>
+      </w:r>
+      <w:r>
+        <w:rPr>
+          <w:rFonts w:ascii="Times New Roman" w:hAnsi="Times New Roman"/>
+          <w:sz w:val="24"/>
+          <w:szCs w:val="24"/>
+        </w:rPr>
+        <w:t>Dec.</w:t>
+      </w:r>
+      <w:r>
+        <w:rPr>
+          <w:rFonts w:ascii="Times New Roman" w:hAnsi="Times New Roman"/>
+          <w:sz w:val="24"/>
+          <w:szCs w:val="24"/>
+        </w:rPr>
+        <w:t xml:space="preserve"> </w:t>
+      </w:r>
+      <w:r>
+        <w:rPr>
+          <w:rFonts w:ascii="Times New Roman" w:hAnsi="Times New Roman"/>
+          <w:sz w:val="24"/>
+          <w:szCs w:val="24"/>
+        </w:rPr>
+        <w:t>3</w:t>
+      </w:r>
+      <w:r>
+        <w:rPr>
+          <w:rFonts w:ascii="Times New Roman" w:hAnsi="Times New Roman"/>
+          <w:sz w:val="24"/>
+          <w:szCs w:val="24"/>
+        </w:rPr>
+        <w:t>, 2025 10:00 AM Eastern Time (US and Canada)</w:t>
       </w:r>
     </w:p>
     <w:p>
@@ -3532,25 +3029,7 @@
           <w:sz w:val="24"/>
           <w:szCs w:val="24"/>
         </w:rPr>
-        <w:t xml:space="preserve">Click the “Subscribe or Unsubscribe” option (purple highlight below) – it will bring you to the next window where you’ll be asked for your email/name (I think it the name is optional to provide). This way, you can subscribe to the mailing list to stay tuned or unsubscribe if you find the seminars irrelevant to you or just get too </w:t>
-      </w:r>
-      <w:proofErr w:type="gramStart"/>
-      <w:r>
-        <w:rPr>
-          <w:rFonts w:ascii="Times New Roman" w:hAnsi="Times New Roman"/>
-          <w:sz w:val="24"/>
-          <w:szCs w:val="24"/>
-        </w:rPr>
-        <w:t>much</w:t>
-      </w:r>
-      <w:proofErr w:type="gramEnd"/>
-      <w:r>
-        <w:rPr>
-          <w:rFonts w:ascii="Times New Roman" w:hAnsi="Times New Roman"/>
-          <w:sz w:val="24"/>
-          <w:szCs w:val="24"/>
-        </w:rPr>
-        <w:t xml:space="preserve"> emails to deal with. </w:t>
+        <w:t xml:space="preserve">Click the “Subscribe or Unsubscribe” option (purple highlight below) – it will bring you to the next window where you’ll be asked for your email/name (I think it the name is optional to provide). This way, you can subscribe to the mailing list to stay tuned or unsubscribe if you find the seminars irrelevant to you or just get too much emails to deal with. </w:t>
       </w:r>
     </w:p>
     <w:p>
@@ -7010,6 +6489,7 @@
   <w:style w:type="character" w:default="1" w:styleId="DefaultParagraphFont">
     <w:name w:val="Default Paragraph Font"/>
     <w:uiPriority w:val="1"/>
+    <w:semiHidden/>
     <w:unhideWhenUsed/>
   </w:style>
   <w:style w:type="table" w:default="1" w:styleId="TableNormal">

</xml_diff>